<commit_message>
Update files for Delta Higher Institute (remove Tanta University references)
Co-Authored-By: Claude Sonnet 5.5 <noreply@anthropic.com>
Claude-Session: https://claude.ai/code/session_0185BhYAfF4xFuPNPfvWLvUn
</commit_message>
<xml_diff>
--- a/logo-competition.docx
+++ b/logo-competition.docx
@@ -34,7 +34,7 @@
           <w:szCs w:val="26"/>
           <w:rtl/>
         </w:rPr>
-        <w:t xml:space="preserve">المعهد الهندسي: بالتعاون مع اتحاد الطلبة</w:t>
+        <w:t xml:space="preserve">معهد الدلتا العالي للهندسة والتكنولوجيا: بالتعاون مع اتحاد الطلبة</w:t>
       </w:r>
     </w:p>
     <w:p>
@@ -50,7 +50,7 @@
           <w:szCs w:val="24"/>
           <w:rtl/>
         </w:rPr>
-        <w:t xml:space="preserve">صمّم الشعار الذي سيمثل أسرتنا أمام المعهد والجامعة، وسيظهر على اللافتات وحاويات الفرز والصفحة الرسمية وملف الأدلة.</w:t>
+        <w:t xml:space="preserve">صمّم الشعار الذي سيمثل أسرتنا أمام المعهد والمجتمع الأكاديمي، وسيظهر على اللافتات وحاويات الفرز والصفحة الرسمية وملف الأدلة.</w:t>
       </w:r>
     </w:p>
     <w:p>

</xml_diff>